<commit_message>
fix: alinear preguntas del cuestionario de empleados con la tesis y el kit de validacion
</commit_message>
<xml_diff>
--- a/proyecto_de_grado/Cuestionario_Empleados.docx
+++ b/proyecto_de_grado/Cuestionario_Empleados.docx
@@ -324,7 +324,7 @@
                 <w:rFonts w:ascii="Times New Roman" w:hAnsi="Times New Roman"/>
                 <w:sz w:val="20"/>
               </w:rPr>
-              <w:t>¿Considera usted que el registro y control manual de los préstamos prendarios genera retrasos en la atención al cliente?</w:t>
+              <w:t>¿Considera que el estado actual de los archivos de Excel permite la integración y cruce eficiente de los datos de la empresa?</w:t>
             </w:r>
           </w:p>
         </w:tc>
@@ -418,7 +418,7 @@
                 <w:rFonts w:ascii="Times New Roman" w:hAnsi="Times New Roman"/>
                 <w:sz w:val="20"/>
               </w:rPr>
-              <w:t>¿Se presentan dificultades para verificar la disponibilidad de los artículos en el inventario al momento de realizar un préstamo?</w:t>
+              <w:t>¿El tiempo de respuesta manual afecta la productividad?</w:t>
             </w:r>
           </w:p>
         </w:tc>
@@ -512,7 +512,7 @@
                 <w:rFonts w:ascii="Times New Roman" w:hAnsi="Times New Roman"/>
                 <w:sz w:val="20"/>
               </w:rPr>
-              <w:t>¿Ocurren pérdidas de información o errores en los cálculos de los intereses debido al registro manual?</w:t>
+              <w:t>¿Se han registrado discrepancias o inconsistencias en los cálculos de intereses y fechas de vencimiento bajo la modalidad manual?</w:t>
             </w:r>
           </w:p>
         </w:tc>
@@ -606,7 +606,7 @@
                 <w:rFonts w:ascii="Times New Roman" w:hAnsi="Times New Roman"/>
                 <w:sz w:val="20"/>
               </w:rPr>
-              <w:t>¿Cree usted necesario implementar un sistema de información para automatizar la gestión de inventario y préstamos?</w:t>
+              <w:t>¿Dispone la empresa de mecanismos automatizados de respaldo para proteger la información frente a fallos del sistema o sobreescrituras?</w:t>
             </w:r>
           </w:p>
         </w:tc>
@@ -700,7 +700,7 @@
                 <w:rFonts w:ascii="Times New Roman" w:hAnsi="Times New Roman"/>
                 <w:sz w:val="20"/>
               </w:rPr>
-              <w:t>¿El sistema propuesto debería generar reportes automáticos de los artículos en custodia y los préstamos vencidos?</w:t>
+              <w:t>¿Es fundamental un sistema centralizado para la trazabilidad?</w:t>
             </w:r>
           </w:p>
         </w:tc>
@@ -794,7 +794,7 @@
                 <w:rFonts w:ascii="Times New Roman" w:hAnsi="Times New Roman"/>
                 <w:sz w:val="20"/>
               </w:rPr>
-              <w:t>¿Considera importante que el sistema permita realizar consultas rápidas sobre el estado de un préstamo por cliente?</w:t>
+              <w:t>¿Deben las interfaces ser intuitivas para facilitar el uso?</w:t>
             </w:r>
           </w:p>
         </w:tc>
@@ -888,7 +888,7 @@
                 <w:rFonts w:ascii="Times New Roman" w:hAnsi="Times New Roman"/>
                 <w:sz w:val="20"/>
               </w:rPr>
-              <w:t>¿Estaría dispuesto a recibir capacitación para el uso del nuevo sistema de información en la empresa?</w:t>
+              <w:t>¿Requiere reportes administrativos automáticos para gerencia?</w:t>
             </w:r>
           </w:p>
         </w:tc>
@@ -982,7 +982,7 @@
                 <w:rFonts w:ascii="Times New Roman" w:hAnsi="Times New Roman"/>
                 <w:sz w:val="20"/>
               </w:rPr>
-              <w:t>¿Cree que la automatización de los procesos mejorará la eficiencia administrativa de la organización?</w:t>
+              <w:t>¿Es la automatización de consultas esencial para el flujo de trabajo?</w:t>
             </w:r>
           </w:p>
         </w:tc>

</xml_diff>

<commit_message>
style: corregir inversion de parrafos, alinear datos sociodemograficos y agregar lineas de firma
</commit_message>
<xml_diff>
--- a/proyecto_de_grado/Cuestionario_Empleados.docx
+++ b/proyecto_de_grado/Cuestionario_Empleados.docx
@@ -144,24 +144,6 @@
         <w:t>Estimado empleado, a continuación se presenta una serie de preguntas cerradas orientadas a recolectar información sobre los procesos actuales de inventario y control de préstamos prendarios. Le solicitamos que responda con la mayor objetividad posible marcando con una equis (X) en la opción que considere pertinente (SÍ o NO). Sus respuestas serán confidenciales y utilizadas exclusivamente para el desarrollo del proyecto de grado de TSU en Informática.</w:t>
       </w:r>
     </w:p>
-    <w:p>
-      <w:pPr>
-        <w:spacing w:after="360" w:line="360" w:lineRule="auto"/>
-      </w:pPr>
-      <w:r>
-        <w:rPr>
-          <w:rFonts w:ascii="Times New Roman" w:hAnsi="Times New Roman"/>
-          <w:sz w:val="22"/>
-        </w:rPr>
-        <w:t>DATOS DEL TRABAJADOR (Opcional):</w:t>
-        <w:br/>
-        <w:t>Lugar de Trabajo: Inversiones Más por tu Oro 17 C.A.</w:t>
-        <w:br/>
-        <w:t>Cargo que desempeña: ___________________________________</w:t>
-        <w:br/>
-        <w:t>Años de experiencia en el área: ___________________________</w:t>
-      </w:r>
-    </w:p>
     <w:tbl>
       <w:tblPr>
         <w:tblW w:type="auto" w:w="0"/>
@@ -194,6 +176,71 @@
               <w:right w:w="100" w:type="dxa"/>
             </w:tcMar>
           </w:tcPr>
+          <w:p>
+            <w:pPr>
+              <w:spacing w:before="240" w:after="120" w:line="360" w:lineRule="auto"/>
+            </w:pPr>
+            <w:r>
+              <w:rPr>
+                <w:rFonts w:ascii="Times New Roman" w:hAnsi="Times New Roman"/>
+                <w:b/>
+                <w:sz w:val="22"/>
+              </w:rPr>
+              <w:t>I. DATOS SOCIODEMOGRÁFICOS</w:t>
+            </w:r>
+          </w:p>
+          <w:p>
+            <w:pPr>
+              <w:spacing w:before="0" w:after="120" w:line="360" w:lineRule="auto"/>
+            </w:pPr>
+            <w:r>
+              <w:rPr>
+                <w:rFonts w:ascii="Times New Roman" w:hAnsi="Times New Roman"/>
+                <w:b w:val="0"/>
+                <w:sz w:val="22"/>
+              </w:rPr>
+              <w:t>Cargo que ocupa: [ ] Gerencia   [ ] Administrativo   [ ] Operativo/Caja</w:t>
+            </w:r>
+          </w:p>
+          <w:p>
+            <w:pPr>
+              <w:spacing w:before="0" w:after="120" w:line="360" w:lineRule="auto"/>
+            </w:pPr>
+            <w:r>
+              <w:rPr>
+                <w:rFonts w:ascii="Times New Roman" w:hAnsi="Times New Roman"/>
+                <w:b w:val="0"/>
+                <w:sz w:val="22"/>
+              </w:rPr>
+              <w:t>Años de experiencia: [ ] Menos de 1 año   [ ] 1 a 3 años   [ ] Más de 3 años</w:t>
+            </w:r>
+          </w:p>
+          <w:p>
+            <w:pPr>
+              <w:spacing w:before="0" w:after="240" w:line="360" w:lineRule="auto"/>
+            </w:pPr>
+            <w:r>
+              <w:rPr>
+                <w:rFonts w:ascii="Times New Roman" w:hAnsi="Times New Roman"/>
+                <w:b w:val="0"/>
+                <w:sz w:val="22"/>
+              </w:rPr>
+              <w:t>Nivel Educativo: [ ] Bachiller   [ ] TSU   [ ] Universitario</w:t>
+            </w:r>
+          </w:p>
+          <w:p>
+            <w:pPr>
+              <w:spacing w:before="120" w:after="120" w:line="360" w:lineRule="auto"/>
+            </w:pPr>
+            <w:r>
+              <w:rPr>
+                <w:rFonts w:ascii="Times New Roman" w:hAnsi="Times New Roman"/>
+                <w:b/>
+                <w:sz w:val="22"/>
+              </w:rPr>
+              <w:t>II. CUESTIONARIO</w:t>
+            </w:r>
+          </w:p>
           <w:p>
             <w:pPr>
               <w:jc w:val="center"/>

</xml_diff>

<commit_message>
style: revertir formato de datos del trabajador a lineas en blanco (identico a hoja impresa)
</commit_message>
<xml_diff>
--- a/proyecto_de_grado/Cuestionario_Empleados.docx
+++ b/proyecto_de_grado/Cuestionario_Empleados.docx
@@ -144,6 +144,24 @@
         <w:t>Estimado empleado, a continuación se presenta una serie de preguntas cerradas orientadas a recolectar información sobre los procesos actuales de inventario y control de préstamos prendarios. Le solicitamos que responda con la mayor objetividad posible marcando con una equis (X) en la opción que considere pertinente (SÍ o NO). Sus respuestas serán confidenciales y utilizadas exclusivamente para el desarrollo del proyecto de grado de TSU en Informática.</w:t>
       </w:r>
     </w:p>
+    <w:p>
+      <w:pPr>
+        <w:spacing w:after="360" w:line="360" w:lineRule="auto"/>
+      </w:pPr>
+      <w:r>
+        <w:rPr>
+          <w:rFonts w:ascii="Times New Roman" w:hAnsi="Times New Roman"/>
+          <w:sz w:val="22"/>
+        </w:rPr>
+        <w:t>DATOS DEL TRABAJADOR (Opcional):</w:t>
+        <w:br/>
+        <w:t>Lugar de Trabajo: Inversiones Más por tu Oro 17 C.A.</w:t>
+        <w:br/>
+        <w:t>Cargo que desempeña: ___________________________________</w:t>
+        <w:br/>
+        <w:t>Años de experiencia en el área: ___________________________</w:t>
+      </w:r>
+    </w:p>
     <w:tbl>
       <w:tblPr>
         <w:tblW w:type="auto" w:w="0"/>
@@ -176,71 +194,6 @@
               <w:right w:w="100" w:type="dxa"/>
             </w:tcMar>
           </w:tcPr>
-          <w:p>
-            <w:pPr>
-              <w:spacing w:before="240" w:after="120" w:line="360" w:lineRule="auto"/>
-            </w:pPr>
-            <w:r>
-              <w:rPr>
-                <w:rFonts w:ascii="Times New Roman" w:hAnsi="Times New Roman"/>
-                <w:b/>
-                <w:sz w:val="22"/>
-              </w:rPr>
-              <w:t>I. DATOS SOCIODEMOGRÁFICOS</w:t>
-            </w:r>
-          </w:p>
-          <w:p>
-            <w:pPr>
-              <w:spacing w:before="0" w:after="120" w:line="360" w:lineRule="auto"/>
-            </w:pPr>
-            <w:r>
-              <w:rPr>
-                <w:rFonts w:ascii="Times New Roman" w:hAnsi="Times New Roman"/>
-                <w:b w:val="0"/>
-                <w:sz w:val="22"/>
-              </w:rPr>
-              <w:t>Cargo que ocupa: [ ] Gerencia   [ ] Administrativo   [ ] Operativo/Caja</w:t>
-            </w:r>
-          </w:p>
-          <w:p>
-            <w:pPr>
-              <w:spacing w:before="0" w:after="120" w:line="360" w:lineRule="auto"/>
-            </w:pPr>
-            <w:r>
-              <w:rPr>
-                <w:rFonts w:ascii="Times New Roman" w:hAnsi="Times New Roman"/>
-                <w:b w:val="0"/>
-                <w:sz w:val="22"/>
-              </w:rPr>
-              <w:t>Años de experiencia: [ ] Menos de 1 año   [ ] 1 a 3 años   [ ] Más de 3 años</w:t>
-            </w:r>
-          </w:p>
-          <w:p>
-            <w:pPr>
-              <w:spacing w:before="0" w:after="240" w:line="360" w:lineRule="auto"/>
-            </w:pPr>
-            <w:r>
-              <w:rPr>
-                <w:rFonts w:ascii="Times New Roman" w:hAnsi="Times New Roman"/>
-                <w:b w:val="0"/>
-                <w:sz w:val="22"/>
-              </w:rPr>
-              <w:t>Nivel Educativo: [ ] Bachiller   [ ] TSU   [ ] Universitario</w:t>
-            </w:r>
-          </w:p>
-          <w:p>
-            <w:pPr>
-              <w:spacing w:before="120" w:after="120" w:line="360" w:lineRule="auto"/>
-            </w:pPr>
-            <w:r>
-              <w:rPr>
-                <w:rFonts w:ascii="Times New Roman" w:hAnsi="Times New Roman"/>
-                <w:b/>
-                <w:sz w:val="22"/>
-              </w:rPr>
-              <w:t>II. CUESTIONARIO</w:t>
-            </w:r>
-          </w:p>
           <w:p>
             <w:pPr>
               <w:jc w:val="center"/>

</xml_diff>

<commit_message>
style: agregar encabezado ANEXO A al cuestionario de empleados para imprimir
</commit_message>
<xml_diff>
--- a/proyecto_de_grado/Cuestionario_Empleados.docx
+++ b/proyecto_de_grado/Cuestionario_Empleados.docx
@@ -111,16 +111,30 @@
     </w:p>
     <w:p>
       <w:pPr>
-        <w:spacing w:after="360"/>
+        <w:spacing w:before="0" w:after="120" w:line="360" w:lineRule="auto"/>
         <w:jc w:val="center"/>
       </w:pPr>
       <w:r>
         <w:rPr>
           <w:rFonts w:ascii="Times New Roman" w:hAnsi="Times New Roman"/>
           <w:b/>
-          <w:sz w:val="28"/>
+          <w:sz w:val="24"/>
         </w:rPr>
-        <w:t>CUESTIONARIO DE RECOLECCIÓN DE DATOS (EMPLEADOS)</w:t>
+        <w:t>ANEXO A</w:t>
+      </w:r>
+    </w:p>
+    <w:p>
+      <w:pPr>
+        <w:spacing w:after="240" w:before="0" w:line="360" w:lineRule="auto"/>
+        <w:jc w:val="center"/>
+      </w:pPr>
+      <w:r>
+        <w:rPr>
+          <w:rFonts w:ascii="Times New Roman" w:hAnsi="Times New Roman"/>
+          <w:b/>
+          <w:sz w:val="24"/>
+        </w:rPr>
+        <w:t>INSTRUMENTO DE RECOLECCIÓN DE DATOS (CUESTIONARIO)</w:t>
       </w:r>
     </w:p>
     <w:p>

</xml_diff>